<commit_message>
Refine chapter ten dialogue and add chapter eleven
</commit_message>
<xml_diff>
--- a/manuscript/chapter-10-the-pathways.docx
+++ b/manuscript/chapter-10-the-pathways.docx
@@ -382,6 +382,16 @@
     </w:p>
     <w:p>
       <w:r>
+        <w:t>"The transfer happened this month," Elara said. "Why would it be filed in a language no one uses anymore?"</w:t>
+      </w:r>
+    </w:p>
+    <w:p>
+      <w:r>
+        <w:t>"Because whoever filed it chose to," Anandi said. "The old protocol still authenticates. It simply predates every audit tool built since. A transaction entered through it is valid and almost invisible in the same motion."</w:t>
+      </w:r>
+    </w:p>
+    <w:p>
+      <w:r>
         <w:t>"Can you get through it?" Elara asked.</w:t>
       </w:r>
     </w:p>

</xml_diff>